<commit_message>
Looker Studio labs started
</commit_message>
<xml_diff>
--- a/Week4/P1Project/P1_Looker_Activity_wPresentation.docx
+++ b/Week4/P1Project/P1_Looker_Activity_wPresentation.docx
@@ -128,7 +128,15 @@
       </w:r>
       <w:proofErr w:type="spellEnd"/>
       <w:r>
-        <w:t>. Check for any formatting issues and fix if necessary. (Bonus points for normalizing data into a small warehouse!)</w:t>
+        <w:t xml:space="preserve">. Check for any formatting issues and </w:t>
+      </w:r>
+      <w:proofErr w:type="gramStart"/>
+      <w:r>
+        <w:t>fix</w:t>
+      </w:r>
+      <w:proofErr w:type="gramEnd"/>
+      <w:r>
+        <w:t xml:space="preserve"> if necessary. (Bonus points for normalizing data into a small warehouse!)</w:t>
       </w:r>
     </w:p>
     <w:p>
@@ -290,14 +298,14 @@
         <w:tab/>
         <w:t xml:space="preserve">You will give a </w:t>
       </w:r>
-      <w:r>
-        <w:t xml:space="preserve">2-3 </w:t>
-      </w:r>
-      <w:proofErr w:type="spellStart"/>
-      <w:r>
-        <w:t>minuts</w:t>
-      </w:r>
-      <w:proofErr w:type="spellEnd"/>
+      <w:proofErr w:type="gramStart"/>
+      <w:r>
+        <w:t>2-3 minut</w:t>
+      </w:r>
+      <w:r>
+        <w:t>e</w:t>
+      </w:r>
+      <w:proofErr w:type="gramEnd"/>
       <w:r>
         <w:t xml:space="preserve"> (</w:t>
       </w:r>
@@ -311,7 +319,13 @@
         <w:t xml:space="preserve"> presentation on your findings on </w:t>
       </w:r>
       <w:r>
+        <w:t xml:space="preserve">Fri. </w:t>
+      </w:r>
+      <w:r>
         <w:t>February 16, 2024</w:t>
+      </w:r>
+      <w:r>
+        <w:t>.</w:t>
       </w:r>
     </w:p>
     <w:p/>
@@ -341,8 +355,13 @@
         </w:numPr>
       </w:pPr>
       <w:r>
-        <w:t>pre-process data explaining in detail any changes, null values removed, type casting if necessary, or any new fields created to hold new data created from existing data</w:t>
-      </w:r>
+        <w:t xml:space="preserve">pre-process data explaining in detail any changes, null values removed, type casting if necessary, or any new fields created to hold new data created from existing </w:t>
+      </w:r>
+      <w:proofErr w:type="gramStart"/>
+      <w:r>
+        <w:t>data</w:t>
+      </w:r>
+      <w:proofErr w:type="gramEnd"/>
     </w:p>
     <w:p>
       <w:pPr>
@@ -361,8 +380,13 @@
       </w:r>
       <w:proofErr w:type="spellEnd"/>
       <w:r>
-        <w:t>, whichever appropriate, any also perform simple two-way comparisons with variables</w:t>
-      </w:r>
+        <w:t xml:space="preserve">, whichever appropriate, any also perform simple two-way comparisons with </w:t>
+      </w:r>
+      <w:proofErr w:type="gramStart"/>
+      <w:r>
+        <w:t>variables</w:t>
+      </w:r>
+      <w:proofErr w:type="gramEnd"/>
     </w:p>
     <w:p>
       <w:pPr>
@@ -373,8 +397,14 @@
         </w:numPr>
       </w:pPr>
       <w:r>
-        <w:t>create a star schema with a corresponding ERD in MySQL or any tool you prefer, and be sure to present this ERD in presentation</w:t>
-      </w:r>
+        <w:lastRenderedPageBreak/>
+        <w:t xml:space="preserve">create a star schema with a corresponding ERD in MySQL or any tool you prefer, and be sure to present this ERD in </w:t>
+      </w:r>
+      <w:proofErr w:type="gramStart"/>
+      <w:r>
+        <w:t>presentation</w:t>
+      </w:r>
+      <w:proofErr w:type="gramEnd"/>
     </w:p>
     <w:p>
       <w:pPr>
@@ -385,7 +415,6 @@
         </w:numPr>
       </w:pPr>
       <w:r>
-        <w:lastRenderedPageBreak/>
         <w:t xml:space="preserve">upload data to </w:t>
       </w:r>
       <w:proofErr w:type="spellStart"/>
@@ -394,8 +423,13 @@
       </w:r>
       <w:proofErr w:type="spellEnd"/>
       <w:r>
-        <w:t xml:space="preserve"> data warehouse with your star schema</w:t>
-      </w:r>
+        <w:t xml:space="preserve"> data warehouse with your star </w:t>
+      </w:r>
+      <w:proofErr w:type="gramStart"/>
+      <w:r>
+        <w:t>schema</w:t>
+      </w:r>
+      <w:proofErr w:type="gramEnd"/>
     </w:p>
     <w:p>
       <w:pPr>

</xml_diff>

<commit_message>
added sql practice sites
</commit_message>
<xml_diff>
--- a/Week4/P1Project/P1_Looker_Activity_wPresentation.docx
+++ b/Week4/P1Project/P1_Looker_Activity_wPresentation.docx
@@ -128,15 +128,7 @@
       </w:r>
       <w:proofErr w:type="spellEnd"/>
       <w:r>
-        <w:t xml:space="preserve">. Check for any formatting issues and </w:t>
-      </w:r>
-      <w:proofErr w:type="gramStart"/>
-      <w:r>
-        <w:t>fix</w:t>
-      </w:r>
-      <w:proofErr w:type="gramEnd"/>
-      <w:r>
-        <w:t xml:space="preserve"> if necessary. (Bonus points for normalizing data into a small warehouse!)</w:t>
+        <w:t>. Check for any formatting issues and fix if necessary. (Bonus points for normalizing data into a small warehouse!)</w:t>
       </w:r>
     </w:p>
     <w:p>
@@ -255,25 +247,6 @@
       </w:pPr>
       <w:r>
         <w:t>(bonus points for finding any other interesting trends/patterns)</w:t>
-      </w:r>
-    </w:p>
-    <w:p>
-      <w:r>
-        <w:t xml:space="preserve">Export this </w:t>
-      </w:r>
-      <w:r>
-        <w:t xml:space="preserve">report to a pdf and send to </w:t>
-      </w:r>
-      <w:hyperlink r:id="rId7" w:history="1">
-        <w:r>
-          <w:rPr>
-            <w:rStyle w:val="Hyperlink"/>
-          </w:rPr>
-          <w:t>william.terry@revature.com</w:t>
-        </w:r>
-      </w:hyperlink>
-      <w:r>
-        <w:t xml:space="preserve"> </w:t>
       </w:r>
     </w:p>
     <w:p/>
@@ -298,14 +271,12 @@
         <w:tab/>
         <w:t xml:space="preserve">You will give a </w:t>
       </w:r>
-      <w:proofErr w:type="gramStart"/>
       <w:r>
         <w:t>2-3 minut</w:t>
       </w:r>
       <w:r>
         <w:t>e</w:t>
       </w:r>
-      <w:proofErr w:type="gramEnd"/>
       <w:r>
         <w:t xml:space="preserve"> (</w:t>
       </w:r>
@@ -355,13 +326,8 @@
         </w:numPr>
       </w:pPr>
       <w:r>
-        <w:t xml:space="preserve">pre-process data explaining in detail any changes, null values removed, type casting if necessary, or any new fields created to hold new data created from existing </w:t>
-      </w:r>
-      <w:proofErr w:type="gramStart"/>
-      <w:r>
-        <w:t>data</w:t>
-      </w:r>
-      <w:proofErr w:type="gramEnd"/>
+        <w:t>pre-process data explaining in detail any changes, null values removed, type casting if necessary, or any new fields created to hold new data created from existing data</w:t>
+      </w:r>
     </w:p>
     <w:p>
       <w:pPr>
@@ -380,13 +346,8 @@
       </w:r>
       <w:proofErr w:type="spellEnd"/>
       <w:r>
-        <w:t xml:space="preserve">, whichever appropriate, any also perform simple two-way comparisons with </w:t>
-      </w:r>
-      <w:proofErr w:type="gramStart"/>
-      <w:r>
-        <w:t>variables</w:t>
-      </w:r>
-      <w:proofErr w:type="gramEnd"/>
+        <w:t>, whichever appropriate, any also perform simple two-way comparisons with variables</w:t>
+      </w:r>
     </w:p>
     <w:p>
       <w:pPr>
@@ -397,14 +358,8 @@
         </w:numPr>
       </w:pPr>
       <w:r>
-        <w:lastRenderedPageBreak/>
-        <w:t xml:space="preserve">create a star schema with a corresponding ERD in MySQL or any tool you prefer, and be sure to present this ERD in </w:t>
-      </w:r>
-      <w:proofErr w:type="gramStart"/>
-      <w:r>
-        <w:t>presentation</w:t>
-      </w:r>
-      <w:proofErr w:type="gramEnd"/>
+        <w:t>create a star schema with a corresponding ERD in MySQL or any tool you prefer, and be sure to present this ERD in presentation</w:t>
+      </w:r>
     </w:p>
     <w:p>
       <w:pPr>
@@ -423,13 +378,8 @@
       </w:r>
       <w:proofErr w:type="spellEnd"/>
       <w:r>
-        <w:t xml:space="preserve"> data warehouse with your star </w:t>
-      </w:r>
-      <w:proofErr w:type="gramStart"/>
-      <w:r>
-        <w:t>schema</w:t>
-      </w:r>
-      <w:proofErr w:type="gramEnd"/>
+        <w:t xml:space="preserve"> data warehouse with your star schema</w:t>
+      </w:r>
     </w:p>
     <w:p>
       <w:pPr>
@@ -440,6 +390,7 @@
         </w:numPr>
       </w:pPr>
       <w:r>
+        <w:lastRenderedPageBreak/>
         <w:t xml:space="preserve">perform queries in </w:t>
       </w:r>
       <w:proofErr w:type="spellStart"/>

</xml_diff>